<commit_message>
Integrate enhanced frontend features from career-practice-ai-main
- Added progress tracking with question indicators
- Enhanced feedback display with completion screen
- Added interview tips and guidance
- Improved visual design with better spacing
- Added score display and action buttons
- Kept existing backend (PostgreSQL, AWS Bedrock, etc.)
- Enhanced user experience with better flow
</commit_message>
<xml_diff>
--- a/Weekly_Update!!!.docx
+++ b/Weekly_Update!!!.docx
@@ -148,17 +148,43 @@
           <w:rFonts w:cs="Calibri"/>
           <w:color w:val="000000" w:themeColor="text1"/>
         </w:rPr>
-        <w:t xml:space="preserve"> </w:t>
-      </w:r>
-    </w:p>
-    <w:p>
-      <w:pPr>
-        <w:ind w:left="360"/>
-        <w:rPr>
-          <w:rFonts w:cs="Calibri"/>
-          <w:color w:val="000000" w:themeColor="text1"/>
-        </w:rPr>
-      </w:pPr>
+        <w:t>I</w:t>
+      </w:r>
+      <w:r>
+        <w:rPr>
+          <w:rFonts w:cs="Calibri"/>
+          <w:color w:val="000000" w:themeColor="text1"/>
+        </w:rPr>
+        <w:t xml:space="preserve">terated through </w:t>
+      </w:r>
+      <w:r>
+        <w:rPr>
+          <w:rFonts w:cs="Calibri"/>
+          <w:color w:val="000000" w:themeColor="text1"/>
+        </w:rPr>
+        <w:t>many</w:t>
+      </w:r>
+      <w:r>
+        <w:rPr>
+          <w:rFonts w:cs="Calibri"/>
+          <w:color w:val="000000" w:themeColor="text1"/>
+        </w:rPr>
+        <w:t xml:space="preserve"> UI themes (</w:t>
+      </w:r>
+      <w:r>
+        <w:rPr>
+          <w:rFonts w:cs="Calibri"/>
+          <w:color w:val="000000" w:themeColor="text1"/>
+        </w:rPr>
+        <w:t xml:space="preserve">Minecraft, </w:t>
+      </w:r>
+      <w:r>
+        <w:rPr>
+          <w:rFonts w:cs="Calibri"/>
+          <w:color w:val="000000" w:themeColor="text1"/>
+        </w:rPr>
+        <w:t>pixel art, pixelated, professional)</w:t>
+      </w:r>
     </w:p>
     <w:p>
       <w:pPr>
@@ -177,7 +203,7 @@
           <w:rFonts w:cs="Calibri"/>
           <w:color w:val="000000" w:themeColor="text1"/>
         </w:rPr>
-        <w:t>Development:</w:t>
+        <w:t>Finalized on clean, modern professional interview platform design</w:t>
       </w:r>
     </w:p>
     <w:p>
@@ -197,17 +223,22 @@
           <w:rFonts w:cs="Calibri"/>
           <w:color w:val="000000" w:themeColor="text1"/>
         </w:rPr>
-        <w:t xml:space="preserve"> </w:t>
-      </w:r>
-    </w:p>
-    <w:p>
-      <w:pPr>
-        <w:pStyle w:val="ListParagraph"/>
-        <w:rPr>
-          <w:rFonts w:cs="Calibri"/>
-          <w:color w:val="000000" w:themeColor="text1"/>
-        </w:rPr>
-      </w:pPr>
+        <w:t>Implemented responsive design with 9</w:t>
+      </w:r>
+      <w:r>
+        <w:rPr>
+          <w:rFonts w:cs="Calibri"/>
+          <w:color w:val="000000" w:themeColor="text1"/>
+        </w:rPr>
+        <w:t>9</w:t>
+      </w:r>
+      <w:r>
+        <w:rPr>
+          <w:rFonts w:cs="Calibri"/>
+          <w:color w:val="000000" w:themeColor="text1"/>
+        </w:rPr>
+        <w:t>% viewport sizing</w:t>
+      </w:r>
     </w:p>
     <w:p>
       <w:pPr>
@@ -226,7 +257,470 @@
           <w:rFonts w:cs="Calibri"/>
           <w:color w:val="000000" w:themeColor="text1"/>
         </w:rPr>
+        <w:t>Professional color scheme (blue/white) with modern shadows and hover effects</w:t>
+      </w:r>
+      <w:r>
+        <w:rPr>
+          <w:rFonts w:cs="Calibri"/>
+          <w:color w:val="000000" w:themeColor="text1"/>
+        </w:rPr>
+        <w:t xml:space="preserve"> </w:t>
+      </w:r>
+    </w:p>
+    <w:p>
+      <w:pPr>
+        <w:pStyle w:val="ListParagraph"/>
+        <w:numPr>
+          <w:ilvl w:val="0"/>
+          <w:numId w:val="1"/>
+        </w:numPr>
+        <w:rPr>
+          <w:rFonts w:cs="Calibri"/>
+          <w:color w:val="000000" w:themeColor="text1"/>
+        </w:rPr>
+      </w:pPr>
+      <w:r>
+        <w:rPr>
+          <w:rFonts w:cs="Calibri"/>
+          <w:color w:val="000000" w:themeColor="text1"/>
+        </w:rPr>
+        <w:t xml:space="preserve">Planned the voice pipeline design: user audio </w:t>
+      </w:r>
+      <w:r>
+        <w:rPr>
+          <w:rFonts w:cs="Calibri" w:hint="eastAsia"/>
+          <w:color w:val="000000" w:themeColor="text1"/>
+        </w:rPr>
+        <w:t>→</w:t>
+      </w:r>
+      <w:r>
+        <w:rPr>
+          <w:rFonts w:cs="Calibri"/>
+          <w:color w:val="000000" w:themeColor="text1"/>
+        </w:rPr>
+        <w:t xml:space="preserve"> S3 </w:t>
+      </w:r>
+      <w:r>
+        <w:rPr>
+          <w:rFonts w:cs="Calibri" w:hint="eastAsia"/>
+          <w:color w:val="000000" w:themeColor="text1"/>
+        </w:rPr>
+        <w:t>→</w:t>
+      </w:r>
+      <w:r>
+        <w:rPr>
+          <w:rFonts w:cs="Calibri"/>
+          <w:color w:val="000000" w:themeColor="text1"/>
+        </w:rPr>
+        <w:t xml:space="preserve"> Transcribe </w:t>
+      </w:r>
+      <w:r>
+        <w:rPr>
+          <w:rFonts w:cs="Calibri" w:hint="eastAsia"/>
+          <w:color w:val="000000" w:themeColor="text1"/>
+        </w:rPr>
+        <w:t>→</w:t>
+      </w:r>
+      <w:r>
+        <w:rPr>
+          <w:rFonts w:cs="Calibri"/>
+          <w:color w:val="000000" w:themeColor="text1"/>
+        </w:rPr>
+        <w:t xml:space="preserve"> evaluation </w:t>
+      </w:r>
+      <w:r>
+        <w:rPr>
+          <w:rFonts w:cs="Calibri" w:hint="eastAsia"/>
+          <w:color w:val="000000" w:themeColor="text1"/>
+        </w:rPr>
+        <w:t>→</w:t>
+      </w:r>
+      <w:r>
+        <w:rPr>
+          <w:rFonts w:cs="Calibri"/>
+          <w:color w:val="000000" w:themeColor="text1"/>
+        </w:rPr>
+        <w:t xml:space="preserve"> dashboard.</w:t>
+      </w:r>
+    </w:p>
+    <w:p>
+      <w:pPr>
+        <w:ind w:left="360"/>
+        <w:rPr>
+          <w:rFonts w:cs="Calibri"/>
+          <w:color w:val="000000" w:themeColor="text1"/>
+        </w:rPr>
+      </w:pPr>
+    </w:p>
+    <w:p>
+      <w:pPr>
+        <w:pStyle w:val="ListParagraph"/>
+        <w:numPr>
+          <w:ilvl w:val="0"/>
+          <w:numId w:val="1"/>
+        </w:numPr>
+        <w:rPr>
+          <w:rFonts w:cs="Calibri"/>
+          <w:color w:val="000000" w:themeColor="text1"/>
+        </w:rPr>
+      </w:pPr>
+      <w:r>
+        <w:rPr>
+          <w:rFonts w:cs="Calibri"/>
+          <w:color w:val="000000" w:themeColor="text1"/>
+        </w:rPr>
+        <w:t>Development:</w:t>
+      </w:r>
+    </w:p>
+    <w:p>
+      <w:pPr>
+        <w:pStyle w:val="ListParagraph"/>
+        <w:numPr>
+          <w:ilvl w:val="0"/>
+          <w:numId w:val="1"/>
+        </w:numPr>
+        <w:rPr>
+          <w:rFonts w:cs="Calibri"/>
+          <w:color w:val="000000" w:themeColor="text1"/>
+        </w:rPr>
+      </w:pPr>
+      <w:r>
+        <w:rPr>
+          <w:rFonts w:cs="Calibri"/>
+          <w:color w:val="000000" w:themeColor="text1"/>
+        </w:rPr>
+        <w:t xml:space="preserve"> </w:t>
+      </w:r>
+      <w:r>
+        <w:rPr>
+          <w:rFonts w:cs="Calibri"/>
+          <w:color w:val="000000" w:themeColor="text1"/>
+        </w:rPr>
+        <w:t>Completed AWS Bedrock integration for AI-powered interview questions and evaluations</w:t>
+      </w:r>
+    </w:p>
+    <w:p>
+      <w:pPr>
+        <w:pStyle w:val="ListParagraph"/>
+        <w:numPr>
+          <w:ilvl w:val="0"/>
+          <w:numId w:val="1"/>
+        </w:numPr>
+        <w:rPr>
+          <w:rFonts w:cs="Calibri"/>
+          <w:color w:val="000000" w:themeColor="text1"/>
+        </w:rPr>
+      </w:pPr>
+      <w:r>
+        <w:rPr>
+          <w:rFonts w:cs="Calibri"/>
+          <w:color w:val="000000" w:themeColor="text1"/>
+        </w:rPr>
+        <w:t>Built PostgreSQL database with Alembic migrations on AWS RDS</w:t>
+      </w:r>
+    </w:p>
+    <w:p>
+      <w:pPr>
+        <w:pStyle w:val="ListParagraph"/>
+        <w:numPr>
+          <w:ilvl w:val="0"/>
+          <w:numId w:val="1"/>
+        </w:numPr>
+        <w:rPr>
+          <w:rFonts w:cs="Calibri"/>
+          <w:color w:val="000000" w:themeColor="text1"/>
+        </w:rPr>
+      </w:pPr>
+      <w:r>
+        <w:rPr>
+          <w:rFonts w:cs="Calibri"/>
+          <w:color w:val="000000" w:themeColor="text1"/>
+        </w:rPr>
+        <w:t>I</w:t>
+      </w:r>
+      <w:r>
+        <w:rPr>
+          <w:rFonts w:cs="Calibri"/>
+          <w:color w:val="000000" w:themeColor="text1"/>
+        </w:rPr>
+        <w:t xml:space="preserve">mplemented full authentication system with JWT tokens and </w:t>
+      </w:r>
+      <w:proofErr w:type="spellStart"/>
+      <w:r>
+        <w:rPr>
+          <w:rFonts w:cs="Calibri"/>
+          <w:color w:val="000000" w:themeColor="text1"/>
+        </w:rPr>
+        <w:t>bcrypt</w:t>
+      </w:r>
+      <w:proofErr w:type="spellEnd"/>
+      <w:r>
+        <w:rPr>
+          <w:rFonts w:cs="Calibri"/>
+          <w:color w:val="000000" w:themeColor="text1"/>
+        </w:rPr>
+        <w:t xml:space="preserve"> password hashing</w:t>
+      </w:r>
+    </w:p>
+    <w:p>
+      <w:pPr>
+        <w:pStyle w:val="ListParagraph"/>
+        <w:numPr>
+          <w:ilvl w:val="0"/>
+          <w:numId w:val="1"/>
+        </w:numPr>
+        <w:rPr>
+          <w:rFonts w:cs="Calibri"/>
+          <w:color w:val="000000" w:themeColor="text1"/>
+        </w:rPr>
+      </w:pPr>
+      <w:r>
+        <w:rPr>
+          <w:rFonts w:cs="Calibri"/>
+          <w:color w:val="000000" w:themeColor="text1"/>
+        </w:rPr>
+        <w:t>Created session management and dashboard APIs</w:t>
+      </w:r>
+    </w:p>
+    <w:p>
+      <w:pPr>
+        <w:pStyle w:val="ListParagraph"/>
+        <w:numPr>
+          <w:ilvl w:val="0"/>
+          <w:numId w:val="1"/>
+        </w:numPr>
+        <w:rPr>
+          <w:rFonts w:cs="Calibri"/>
+          <w:color w:val="000000" w:themeColor="text1"/>
+        </w:rPr>
+      </w:pPr>
+      <w:r>
+        <w:rPr>
+          <w:rFonts w:cs="Calibri"/>
+          <w:color w:val="000000" w:themeColor="text1"/>
+        </w:rPr>
+        <w:t>Built complete frontend interview simulator with login/signup UI</w:t>
+      </w:r>
+    </w:p>
+    <w:p>
+      <w:pPr>
+        <w:pStyle w:val="ListParagraph"/>
+        <w:numPr>
+          <w:ilvl w:val="0"/>
+          <w:numId w:val="1"/>
+        </w:numPr>
+        <w:rPr>
+          <w:rFonts w:cs="Calibri"/>
+          <w:color w:val="000000" w:themeColor="text1"/>
+        </w:rPr>
+      </w:pPr>
+      <w:r>
+        <w:rPr>
+          <w:rFonts w:cs="Calibri"/>
+          <w:color w:val="000000" w:themeColor="text1"/>
+        </w:rPr>
+        <w:t>Connected frontend to backend with real-time AI evaluations</w:t>
+      </w:r>
+    </w:p>
+    <w:p>
+      <w:pPr>
+        <w:pStyle w:val="ListParagraph"/>
+        <w:numPr>
+          <w:ilvl w:val="0"/>
+          <w:numId w:val="1"/>
+        </w:numPr>
+        <w:rPr>
+          <w:rFonts w:cs="Calibri"/>
+          <w:color w:val="000000" w:themeColor="text1"/>
+        </w:rPr>
+      </w:pPr>
+      <w:r>
+        <w:rPr>
+          <w:rFonts w:cs="Calibri"/>
+          <w:color w:val="000000" w:themeColor="text1"/>
+        </w:rPr>
+        <w:t>Database connected to AWS RDS with users and sessions tables</w:t>
+      </w:r>
+    </w:p>
+    <w:p>
+      <w:pPr>
+        <w:pStyle w:val="ListParagraph"/>
+        <w:rPr>
+          <w:rFonts w:cs="Calibri"/>
+          <w:color w:val="000000" w:themeColor="text1"/>
+        </w:rPr>
+      </w:pPr>
+    </w:p>
+    <w:p>
+      <w:pPr>
+        <w:pStyle w:val="ListParagraph"/>
+        <w:numPr>
+          <w:ilvl w:val="0"/>
+          <w:numId w:val="1"/>
+        </w:numPr>
+        <w:rPr>
+          <w:rFonts w:cs="Calibri"/>
+          <w:color w:val="000000" w:themeColor="text1"/>
+        </w:rPr>
+      </w:pPr>
+      <w:r>
+        <w:rPr>
+          <w:rFonts w:cs="Calibri"/>
+          <w:color w:val="000000" w:themeColor="text1"/>
+        </w:rPr>
         <w:t xml:space="preserve">Learning (e.g. new language, framework, tools) </w:t>
+      </w:r>
+    </w:p>
+    <w:p>
+      <w:pPr>
+        <w:pStyle w:val="ListParagraph"/>
+        <w:numPr>
+          <w:ilvl w:val="0"/>
+          <w:numId w:val="1"/>
+        </w:numPr>
+        <w:rPr>
+          <w:rFonts w:cs="Calibri"/>
+          <w:color w:val="000000" w:themeColor="text1"/>
+        </w:rPr>
+      </w:pPr>
+      <w:r>
+        <w:rPr>
+          <w:rFonts w:cs="Calibri"/>
+          <w:color w:val="000000" w:themeColor="text1"/>
+        </w:rPr>
+        <w:t>Mastered AWS Bedrock API for Claude/Llama LLM integration</w:t>
+      </w:r>
+    </w:p>
+    <w:p>
+      <w:pPr>
+        <w:pStyle w:val="ListParagraph"/>
+        <w:numPr>
+          <w:ilvl w:val="0"/>
+          <w:numId w:val="1"/>
+        </w:numPr>
+        <w:rPr>
+          <w:rFonts w:cs="Calibri"/>
+          <w:color w:val="000000" w:themeColor="text1"/>
+        </w:rPr>
+      </w:pPr>
+      <w:r>
+        <w:rPr>
+          <w:rFonts w:cs="Calibri"/>
+          <w:color w:val="000000" w:themeColor="text1"/>
+        </w:rPr>
+        <w:t>Learned database migrations with Alembic for PostgreSQL</w:t>
+      </w:r>
+    </w:p>
+    <w:p>
+      <w:pPr>
+        <w:pStyle w:val="ListParagraph"/>
+        <w:numPr>
+          <w:ilvl w:val="0"/>
+          <w:numId w:val="1"/>
+        </w:numPr>
+        <w:rPr>
+          <w:rFonts w:cs="Calibri"/>
+          <w:color w:val="000000" w:themeColor="text1"/>
+        </w:rPr>
+      </w:pPr>
+      <w:r>
+        <w:rPr>
+          <w:rFonts w:cs="Calibri"/>
+          <w:color w:val="000000" w:themeColor="text1"/>
+        </w:rPr>
+        <w:t>I</w:t>
+      </w:r>
+      <w:r>
+        <w:rPr>
+          <w:rFonts w:cs="Calibri"/>
+          <w:color w:val="000000" w:themeColor="text1"/>
+        </w:rPr>
+        <w:t>mplemented JWT authentication with python-</w:t>
+      </w:r>
+      <w:proofErr w:type="spellStart"/>
+      <w:r>
+        <w:rPr>
+          <w:rFonts w:cs="Calibri"/>
+          <w:color w:val="000000" w:themeColor="text1"/>
+        </w:rPr>
+        <w:t>jose</w:t>
+      </w:r>
+      <w:proofErr w:type="spellEnd"/>
+      <w:r>
+        <w:rPr>
+          <w:rFonts w:cs="Calibri"/>
+          <w:color w:val="000000" w:themeColor="text1"/>
+        </w:rPr>
+        <w:t xml:space="preserve"> and </w:t>
+      </w:r>
+      <w:proofErr w:type="spellStart"/>
+      <w:r>
+        <w:rPr>
+          <w:rFonts w:cs="Calibri"/>
+          <w:color w:val="000000" w:themeColor="text1"/>
+        </w:rPr>
+        <w:t>bcrypt</w:t>
+      </w:r>
+      <w:proofErr w:type="spellEnd"/>
+    </w:p>
+    <w:p>
+      <w:pPr>
+        <w:pStyle w:val="ListParagraph"/>
+        <w:numPr>
+          <w:ilvl w:val="0"/>
+          <w:numId w:val="1"/>
+        </w:numPr>
+        <w:rPr>
+          <w:rFonts w:cs="Calibri"/>
+          <w:color w:val="000000" w:themeColor="text1"/>
+        </w:rPr>
+      </w:pPr>
+      <w:r>
+        <w:rPr>
+          <w:rFonts w:cs="Calibri"/>
+          <w:color w:val="000000" w:themeColor="text1"/>
+        </w:rPr>
+        <w:t>Built dashboard with statistics and history tracking</w:t>
+      </w:r>
+    </w:p>
+    <w:p>
+      <w:pPr>
+        <w:pStyle w:val="ListParagraph"/>
+        <w:numPr>
+          <w:ilvl w:val="0"/>
+          <w:numId w:val="1"/>
+        </w:numPr>
+        <w:rPr>
+          <w:rFonts w:cs="Calibri"/>
+          <w:color w:val="000000" w:themeColor="text1"/>
+        </w:rPr>
+      </w:pPr>
+      <w:r>
+        <w:rPr>
+          <w:rFonts w:cs="Calibri"/>
+          <w:color w:val="000000" w:themeColor="text1"/>
+        </w:rPr>
+        <w:t>Applied pixel art design principles with CSS image-rendering</w:t>
+      </w:r>
+    </w:p>
+    <w:p>
+      <w:pPr>
+        <w:pStyle w:val="ListParagraph"/>
+        <w:numPr>
+          <w:ilvl w:val="0"/>
+          <w:numId w:val="1"/>
+        </w:numPr>
+        <w:rPr>
+          <w:rFonts w:cs="Calibri"/>
+          <w:color w:val="000000" w:themeColor="text1"/>
+        </w:rPr>
+      </w:pPr>
+      <w:r>
+        <w:rPr>
+          <w:rFonts w:cs="Calibri"/>
+          <w:color w:val="000000" w:themeColor="text1"/>
+        </w:rPr>
+        <w:t>Learned Silkscreen font for retro/pixel aesthetic</w:t>
       </w:r>
     </w:p>
     <w:p>
@@ -319,6 +813,7 @@
                 <w:rFonts w:cs="Calibri"/>
                 <w:color w:val="000000" w:themeColor="text1"/>
               </w:rPr>
+              <w:lastRenderedPageBreak/>
               <w:t>Week</w:t>
             </w:r>
           </w:p>
@@ -864,48 +1359,590 @@
                 <w:color w:val="000000" w:themeColor="text1"/>
               </w:rPr>
             </w:pPr>
-          </w:p>
-        </w:tc>
-        <w:tc>
-          <w:tcPr>
-            <w:tcW w:w="2946" w:type="dxa"/>
-            <w:vAlign w:val="center"/>
-          </w:tcPr>
-          <w:p>
-            <w:pPr>
-              <w:rPr>
-                <w:rFonts w:cs="Calibri"/>
-                <w:color w:val="000000" w:themeColor="text1"/>
-              </w:rPr>
-            </w:pPr>
-          </w:p>
-        </w:tc>
-        <w:tc>
-          <w:tcPr>
-            <w:tcW w:w="2946" w:type="dxa"/>
-            <w:vAlign w:val="center"/>
-          </w:tcPr>
-          <w:p>
-            <w:pPr>
-              <w:rPr>
-                <w:rFonts w:cs="Calibri"/>
-                <w:color w:val="000000" w:themeColor="text1"/>
-              </w:rPr>
-            </w:pPr>
-          </w:p>
-        </w:tc>
-        <w:tc>
-          <w:tcPr>
-            <w:tcW w:w="2946" w:type="dxa"/>
-            <w:vAlign w:val="center"/>
-          </w:tcPr>
-          <w:p>
-            <w:pPr>
-              <w:rPr>
-                <w:rFonts w:cs="Calibri"/>
-                <w:color w:val="000000" w:themeColor="text1"/>
-              </w:rPr>
-            </w:pPr>
+            <w:r>
+              <w:rPr>
+                <w:rFonts w:cs="Calibri"/>
+                <w:color w:val="000000" w:themeColor="text1"/>
+              </w:rPr>
+              <w:t xml:space="preserve"> </w:t>
+            </w:r>
+            <w:r>
+              <w:rPr>
+                <w:rFonts w:cs="Calibri"/>
+                <w:color w:val="000000" w:themeColor="text1"/>
+              </w:rPr>
+              <w:t>•</w:t>
+            </w:r>
+            <w:r>
+              <w:rPr>
+                <w:rFonts w:cs="Calibri"/>
+                <w:color w:val="000000" w:themeColor="text1"/>
+              </w:rPr>
+              <w:tab/>
+              <w:t>Connect backend to AWS RDS (PostgreSQL)</w:t>
+            </w:r>
+          </w:p>
+          <w:p>
+            <w:pPr>
+              <w:rPr>
+                <w:rFonts w:cs="Calibri"/>
+                <w:color w:val="000000" w:themeColor="text1"/>
+              </w:rPr>
+            </w:pPr>
+            <w:r>
+              <w:rPr>
+                <w:rFonts w:cs="Calibri"/>
+                <w:color w:val="000000" w:themeColor="text1"/>
+              </w:rPr>
+              <w:t>•</w:t>
+            </w:r>
+            <w:r>
+              <w:rPr>
+                <w:rFonts w:cs="Calibri"/>
+                <w:color w:val="000000" w:themeColor="text1"/>
+              </w:rPr>
+              <w:tab/>
+              <w:t>Test Bedrock integration for live question generation</w:t>
+            </w:r>
+          </w:p>
+          <w:p>
+            <w:pPr>
+              <w:rPr>
+                <w:rFonts w:cs="Calibri"/>
+                <w:color w:val="000000" w:themeColor="text1"/>
+              </w:rPr>
+            </w:pPr>
+            <w:r>
+              <w:rPr>
+                <w:rFonts w:cs="Calibri"/>
+                <w:color w:val="000000" w:themeColor="text1"/>
+              </w:rPr>
+              <w:t>•</w:t>
+            </w:r>
+            <w:r>
+              <w:rPr>
+                <w:rFonts w:cs="Calibri"/>
+                <w:color w:val="000000" w:themeColor="text1"/>
+              </w:rPr>
+              <w:tab/>
+              <w:t>Implement Alembic migrations remotely</w:t>
+            </w:r>
+          </w:p>
+          <w:p>
+            <w:pPr>
+              <w:rPr>
+                <w:rFonts w:cs="Calibri"/>
+                <w:color w:val="000000" w:themeColor="text1"/>
+              </w:rPr>
+            </w:pPr>
+            <w:r>
+              <w:rPr>
+                <w:rFonts w:cs="Calibri"/>
+                <w:color w:val="000000" w:themeColor="text1"/>
+              </w:rPr>
+              <w:t>•</w:t>
+            </w:r>
+            <w:r>
+              <w:rPr>
+                <w:rFonts w:cs="Calibri"/>
+                <w:color w:val="000000" w:themeColor="text1"/>
+              </w:rPr>
+              <w:tab/>
+              <w:t>Integrate backend with React frontend</w:t>
+            </w:r>
+          </w:p>
+          <w:p>
+            <w:pPr>
+              <w:rPr>
+                <w:rFonts w:cs="Calibri"/>
+                <w:color w:val="000000" w:themeColor="text1"/>
+              </w:rPr>
+            </w:pPr>
+            <w:r>
+              <w:rPr>
+                <w:rFonts w:cs="Calibri"/>
+                <w:color w:val="000000" w:themeColor="text1"/>
+              </w:rPr>
+              <w:t>•</w:t>
+            </w:r>
+            <w:r>
+              <w:rPr>
+                <w:rFonts w:cs="Calibri"/>
+                <w:color w:val="000000" w:themeColor="text1"/>
+              </w:rPr>
+              <w:tab/>
+              <w:t>Begin S3 &amp; Transcribe setup for voice features</w:t>
+            </w:r>
+          </w:p>
+        </w:tc>
+        <w:tc>
+          <w:tcPr>
+            <w:tcW w:w="2946" w:type="dxa"/>
+            <w:vAlign w:val="center"/>
+          </w:tcPr>
+          <w:p>
+            <w:pPr>
+              <w:rPr>
+                <w:rFonts w:cs="Calibri"/>
+                <w:color w:val="000000" w:themeColor="text1"/>
+              </w:rPr>
+            </w:pPr>
+            <w:r>
+              <w:rPr>
+                <w:rFonts w:cs="Calibri"/>
+                <w:color w:val="000000" w:themeColor="text1"/>
+              </w:rPr>
+              <w:t xml:space="preserve">  </w:t>
+            </w:r>
+            <w:r>
+              <w:rPr>
+                <w:rFonts w:cs="Calibri"/>
+                <w:color w:val="000000" w:themeColor="text1"/>
+              </w:rPr>
+              <w:t>•</w:t>
+            </w:r>
+            <w:r>
+              <w:rPr>
+                <w:rFonts w:cs="Calibri"/>
+                <w:color w:val="000000" w:themeColor="text1"/>
+              </w:rPr>
+              <w:tab/>
+              <w:t>Created and connected AWS RDS PostgreSQL instance</w:t>
+            </w:r>
+          </w:p>
+          <w:p>
+            <w:pPr>
+              <w:rPr>
+                <w:rFonts w:cs="Calibri"/>
+                <w:color w:val="000000" w:themeColor="text1"/>
+              </w:rPr>
+            </w:pPr>
+            <w:r>
+              <w:rPr>
+                <w:rFonts w:cs="Calibri"/>
+                <w:color w:val="000000" w:themeColor="text1"/>
+              </w:rPr>
+              <w:t>•</w:t>
+            </w:r>
+            <w:r>
+              <w:rPr>
+                <w:rFonts w:cs="Calibri"/>
+                <w:color w:val="000000" w:themeColor="text1"/>
+              </w:rPr>
+              <w:tab/>
+              <w:t>Fixed inbound rules and network access for RDS</w:t>
+            </w:r>
+          </w:p>
+          <w:p>
+            <w:pPr>
+              <w:rPr>
+                <w:rFonts w:cs="Calibri"/>
+                <w:color w:val="000000" w:themeColor="text1"/>
+              </w:rPr>
+            </w:pPr>
+            <w:r>
+              <w:rPr>
+                <w:rFonts w:cs="Calibri"/>
+                <w:color w:val="000000" w:themeColor="text1"/>
+              </w:rPr>
+              <w:t>•</w:t>
+            </w:r>
+            <w:r>
+              <w:rPr>
+                <w:rFonts w:cs="Calibri"/>
+                <w:color w:val="000000" w:themeColor="text1"/>
+              </w:rPr>
+              <w:tab/>
+              <w:t xml:space="preserve">Verified database connection through </w:t>
+            </w:r>
+            <w:proofErr w:type="spellStart"/>
+            <w:r>
+              <w:rPr>
+                <w:rFonts w:cs="Calibri"/>
+                <w:color w:val="000000" w:themeColor="text1"/>
+              </w:rPr>
+              <w:t>FastAPI</w:t>
+            </w:r>
+            <w:proofErr w:type="spellEnd"/>
+          </w:p>
+          <w:p>
+            <w:pPr>
+              <w:rPr>
+                <w:rFonts w:cs="Calibri"/>
+                <w:color w:val="000000" w:themeColor="text1"/>
+              </w:rPr>
+            </w:pPr>
+            <w:r>
+              <w:rPr>
+                <w:rFonts w:cs="Calibri"/>
+                <w:color w:val="000000" w:themeColor="text1"/>
+              </w:rPr>
+              <w:t>•</w:t>
+            </w:r>
+            <w:r>
+              <w:rPr>
+                <w:rFonts w:cs="Calibri"/>
+                <w:color w:val="000000" w:themeColor="text1"/>
+              </w:rPr>
+              <w:tab/>
+              <w:t>Successfully stored and fetched sessions in RDS</w:t>
+            </w:r>
+          </w:p>
+          <w:p>
+            <w:pPr>
+              <w:rPr>
+                <w:rFonts w:cs="Calibri"/>
+                <w:color w:val="000000" w:themeColor="text1"/>
+              </w:rPr>
+            </w:pPr>
+            <w:r>
+              <w:rPr>
+                <w:rFonts w:cs="Calibri"/>
+                <w:color w:val="000000" w:themeColor="text1"/>
+              </w:rPr>
+              <w:t>•</w:t>
+            </w:r>
+            <w:r>
+              <w:rPr>
+                <w:rFonts w:cs="Calibri"/>
+                <w:color w:val="000000" w:themeColor="text1"/>
+              </w:rPr>
+              <w:tab/>
+              <w:t>Deployed dashboard routes and frontend charts</w:t>
+            </w:r>
+          </w:p>
+          <w:p>
+            <w:pPr>
+              <w:rPr>
+                <w:rFonts w:cs="Calibri"/>
+                <w:color w:val="000000" w:themeColor="text1"/>
+              </w:rPr>
+            </w:pPr>
+            <w:r>
+              <w:rPr>
+                <w:rFonts w:cs="Calibri"/>
+                <w:color w:val="000000" w:themeColor="text1"/>
+              </w:rPr>
+              <w:t>•</w:t>
+            </w:r>
+            <w:r>
+              <w:rPr>
+                <w:rFonts w:cs="Calibri"/>
+                <w:color w:val="000000" w:themeColor="text1"/>
+              </w:rPr>
+              <w:tab/>
+              <w:t>Started AWS S3 bucket and IAM permissions setup</w:t>
+            </w:r>
+          </w:p>
+        </w:tc>
+        <w:tc>
+          <w:tcPr>
+            <w:tcW w:w="2946" w:type="dxa"/>
+            <w:vAlign w:val="center"/>
+          </w:tcPr>
+          <w:p>
+            <w:pPr>
+              <w:rPr>
+                <w:rFonts w:cs="Calibri"/>
+                <w:color w:val="000000" w:themeColor="text1"/>
+              </w:rPr>
+            </w:pPr>
+            <w:r>
+              <w:rPr>
+                <w:rFonts w:cs="Calibri"/>
+                <w:color w:val="000000" w:themeColor="text1"/>
+              </w:rPr>
+              <w:t>Fully functional backend connected to cloud database</w:t>
+            </w:r>
+          </w:p>
+          <w:p>
+            <w:pPr>
+              <w:rPr>
+                <w:rFonts w:cs="Calibri"/>
+                <w:color w:val="000000" w:themeColor="text1"/>
+              </w:rPr>
+            </w:pPr>
+            <w:r>
+              <w:rPr>
+                <w:rFonts w:cs="Calibri"/>
+                <w:color w:val="000000" w:themeColor="text1"/>
+              </w:rPr>
+              <w:t>•</w:t>
+            </w:r>
+            <w:r>
+              <w:rPr>
+                <w:rFonts w:cs="Calibri"/>
+                <w:color w:val="000000" w:themeColor="text1"/>
+              </w:rPr>
+              <w:tab/>
+              <w:t>Verified POST /</w:t>
+            </w:r>
+            <w:proofErr w:type="spellStart"/>
+            <w:r>
+              <w:rPr>
+                <w:rFonts w:cs="Calibri"/>
+                <w:color w:val="000000" w:themeColor="text1"/>
+              </w:rPr>
+              <w:t>api</w:t>
+            </w:r>
+            <w:proofErr w:type="spellEnd"/>
+            <w:r>
+              <w:rPr>
+                <w:rFonts w:cs="Calibri"/>
+                <w:color w:val="000000" w:themeColor="text1"/>
+              </w:rPr>
+              <w:t>/sessions and GET /</w:t>
+            </w:r>
+            <w:proofErr w:type="spellStart"/>
+            <w:r>
+              <w:rPr>
+                <w:rFonts w:cs="Calibri"/>
+                <w:color w:val="000000" w:themeColor="text1"/>
+              </w:rPr>
+              <w:t>api</w:t>
+            </w:r>
+            <w:proofErr w:type="spellEnd"/>
+            <w:r>
+              <w:rPr>
+                <w:rFonts w:cs="Calibri"/>
+                <w:color w:val="000000" w:themeColor="text1"/>
+              </w:rPr>
+              <w:t>/sessions returning data</w:t>
+            </w:r>
+          </w:p>
+          <w:p>
+            <w:pPr>
+              <w:rPr>
+                <w:rFonts w:cs="Calibri"/>
+                <w:color w:val="000000" w:themeColor="text1"/>
+              </w:rPr>
+            </w:pPr>
+            <w:r>
+              <w:rPr>
+                <w:rFonts w:cs="Calibri"/>
+                <w:color w:val="000000" w:themeColor="text1"/>
+              </w:rPr>
+              <w:t>•</w:t>
+            </w:r>
+            <w:r>
+              <w:rPr>
+                <w:rFonts w:cs="Calibri"/>
+                <w:color w:val="000000" w:themeColor="text1"/>
+              </w:rPr>
+              <w:tab/>
+              <w:t>Dashboard shows real statistics and history from RDS</w:t>
+            </w:r>
+          </w:p>
+          <w:p>
+            <w:pPr>
+              <w:rPr>
+                <w:rFonts w:cs="Calibri"/>
+                <w:color w:val="000000" w:themeColor="text1"/>
+              </w:rPr>
+            </w:pPr>
+            <w:r>
+              <w:rPr>
+                <w:rFonts w:cs="Calibri"/>
+                <w:color w:val="000000" w:themeColor="text1"/>
+              </w:rPr>
+              <w:t>•</w:t>
+            </w:r>
+            <w:r>
+              <w:rPr>
+                <w:rFonts w:cs="Calibri"/>
+                <w:color w:val="000000" w:themeColor="text1"/>
+              </w:rPr>
+              <w:tab/>
+              <w:t>All commits pushed to GitHub repository</w:t>
+            </w:r>
+          </w:p>
+        </w:tc>
+        <w:tc>
+          <w:tcPr>
+            <w:tcW w:w="2946" w:type="dxa"/>
+            <w:vAlign w:val="center"/>
+          </w:tcPr>
+          <w:p>
+            <w:pPr>
+              <w:rPr>
+                <w:rFonts w:cs="Calibri"/>
+                <w:color w:val="000000" w:themeColor="text1"/>
+              </w:rPr>
+            </w:pPr>
+            <w:r>
+              <w:rPr>
+                <w:rFonts w:cs="Calibri"/>
+                <w:color w:val="000000" w:themeColor="text1"/>
+              </w:rPr>
+              <w:t xml:space="preserve"> </w:t>
+            </w:r>
+            <w:r>
+              <w:rPr>
+                <w:rFonts w:cs="Calibri"/>
+                <w:color w:val="000000" w:themeColor="text1"/>
+              </w:rPr>
+              <w:t>•</w:t>
+            </w:r>
+            <w:r>
+              <w:rPr>
+                <w:rFonts w:cs="Calibri"/>
+                <w:color w:val="000000" w:themeColor="text1"/>
+              </w:rPr>
+              <w:tab/>
+              <w:t>Could have configured S3 and Transcribe earlier in parallel with RDS</w:t>
+            </w:r>
+          </w:p>
+          <w:p>
+            <w:pPr>
+              <w:rPr>
+                <w:rFonts w:cs="Calibri"/>
+                <w:color w:val="000000" w:themeColor="text1"/>
+              </w:rPr>
+            </w:pPr>
+            <w:r>
+              <w:rPr>
+                <w:rFonts w:cs="Calibri"/>
+                <w:color w:val="000000" w:themeColor="text1"/>
+              </w:rPr>
+              <w:t>•</w:t>
+            </w:r>
+            <w:r>
+              <w:rPr>
+                <w:rFonts w:cs="Calibri"/>
+                <w:color w:val="000000" w:themeColor="text1"/>
+              </w:rPr>
+              <w:tab/>
+              <w:t>Should have allocated time for deployment testing on Elastic Beanstalk</w:t>
+            </w:r>
+          </w:p>
+          <w:p>
+            <w:pPr>
+              <w:rPr>
+                <w:rFonts w:cs="Calibri"/>
+                <w:color w:val="000000" w:themeColor="text1"/>
+              </w:rPr>
+            </w:pPr>
+            <w:r>
+              <w:rPr>
+                <w:rFonts w:cs="Calibri"/>
+                <w:color w:val="000000" w:themeColor="text1"/>
+              </w:rPr>
+              <w:t>•</w:t>
+            </w:r>
+            <w:r>
+              <w:rPr>
+                <w:rFonts w:cs="Calibri"/>
+                <w:color w:val="000000" w:themeColor="text1"/>
+              </w:rPr>
+              <w:tab/>
+              <w:t>Need to improve error handling for network timeouts</w:t>
+            </w:r>
+          </w:p>
+          <w:p>
+            <w:pPr>
+              <w:rPr>
+                <w:rFonts w:cs="Calibri"/>
+                <w:color w:val="000000" w:themeColor="text1"/>
+              </w:rPr>
+            </w:pPr>
+            <w:r>
+              <w:rPr>
+                <w:rFonts w:cs="Calibri"/>
+                <w:color w:val="000000" w:themeColor="text1"/>
+              </w:rPr>
+              <w:t>•</w:t>
+            </w:r>
+            <w:r>
+              <w:rPr>
+                <w:rFonts w:cs="Calibri"/>
+                <w:color w:val="000000" w:themeColor="text1"/>
+              </w:rPr>
+              <w:tab/>
+              <w:t>AWS RDS connection and migrations succeeded without data loss</w:t>
+            </w:r>
+          </w:p>
+          <w:p>
+            <w:pPr>
+              <w:rPr>
+                <w:rFonts w:cs="Calibri"/>
+                <w:color w:val="000000" w:themeColor="text1"/>
+              </w:rPr>
+            </w:pPr>
+            <w:r>
+              <w:rPr>
+                <w:rFonts w:cs="Calibri"/>
+                <w:color w:val="000000" w:themeColor="text1"/>
+              </w:rPr>
+              <w:t>•</w:t>
+            </w:r>
+            <w:r>
+              <w:rPr>
+                <w:rFonts w:cs="Calibri"/>
+                <w:color w:val="000000" w:themeColor="text1"/>
+              </w:rPr>
+              <w:tab/>
+              <w:t>Dashboard visualization now pulls live data from AWS</w:t>
+            </w:r>
+          </w:p>
+          <w:p>
+            <w:pPr>
+              <w:rPr>
+                <w:rFonts w:cs="Calibri" w:hint="eastAsia"/>
+                <w:color w:val="000000" w:themeColor="text1"/>
+              </w:rPr>
+            </w:pPr>
+            <w:r>
+              <w:rPr>
+                <w:rFonts w:cs="Calibri" w:hint="eastAsia"/>
+                <w:color w:val="000000" w:themeColor="text1"/>
+              </w:rPr>
+              <w:t>•</w:t>
+            </w:r>
+            <w:r>
+              <w:rPr>
+                <w:rFonts w:cs="Calibri" w:hint="eastAsia"/>
+                <w:color w:val="000000" w:themeColor="text1"/>
+              </w:rPr>
+              <w:tab/>
+              <w:t xml:space="preserve">Frontend </w:t>
+            </w:r>
+            <w:r>
+              <w:rPr>
+                <w:rFonts w:cs="Calibri" w:hint="eastAsia"/>
+                <w:color w:val="000000" w:themeColor="text1"/>
+              </w:rPr>
+              <w:t>↔</w:t>
+            </w:r>
+            <w:r>
+              <w:rPr>
+                <w:rFonts w:cs="Calibri" w:hint="eastAsia"/>
+                <w:color w:val="000000" w:themeColor="text1"/>
+              </w:rPr>
+              <w:t xml:space="preserve"> Backend integration stable and tested</w:t>
+            </w:r>
+          </w:p>
+          <w:p>
+            <w:pPr>
+              <w:rPr>
+                <w:rFonts w:cs="Calibri"/>
+                <w:color w:val="000000" w:themeColor="text1"/>
+              </w:rPr>
+            </w:pPr>
+            <w:r>
+              <w:rPr>
+                <w:rFonts w:cs="Calibri"/>
+                <w:color w:val="000000" w:themeColor="text1"/>
+              </w:rPr>
+              <w:t>•</w:t>
+            </w:r>
+            <w:r>
+              <w:rPr>
+                <w:rFonts w:cs="Calibri"/>
+                <w:color w:val="000000" w:themeColor="text1"/>
+              </w:rPr>
+              <w:tab/>
+              <w:t>IAM configuration for S3 and Transcribe completed successfully</w:t>
+            </w:r>
           </w:p>
         </w:tc>
       </w:tr>
@@ -1367,6 +2404,489 @@
     </w:p>
     <w:p>
       <w:pPr>
+        <w:rPr>
+          <w:rFonts w:cs="Calibri"/>
+          <w:color w:val="000000" w:themeColor="text1"/>
+        </w:rPr>
+      </w:pPr>
+      <w:r>
+        <w:rPr>
+          <w:rFonts w:cs="Calibri"/>
+          <w:color w:val="000000" w:themeColor="text1"/>
+        </w:rPr>
+        <w:t xml:space="preserve">This week the project officially moved from local development to AWS-hosted infrastructure. I learned how to configure RDS network access, handle IAM roles, and verify cloud connectivity through </w:t>
+      </w:r>
+      <w:proofErr w:type="spellStart"/>
+      <w:r>
+        <w:rPr>
+          <w:rFonts w:cs="Calibri"/>
+          <w:color w:val="000000" w:themeColor="text1"/>
+        </w:rPr>
+        <w:t>FastAPI</w:t>
+      </w:r>
+      <w:proofErr w:type="spellEnd"/>
+      <w:r>
+        <w:rPr>
+          <w:rFonts w:cs="Calibri"/>
+          <w:color w:val="000000" w:themeColor="text1"/>
+        </w:rPr>
+        <w:t>. After connecting RDS successfully, I confirmed that session data is stored and fetched live from AWS. The analytics dashboard is now powered by real backend data instead of mock objects, which makes testing much more realistic. I also began the groundwork for the voice-input feature by creating the S3 bucket and granting Transcribe access, setting up for next week’s audio-upload and speech-to-text work.</w:t>
+      </w:r>
+    </w:p>
+    <w:p>
+      <w:pPr>
+        <w:rPr>
+          <w:rFonts w:cs="Calibri"/>
+          <w:color w:val="000000" w:themeColor="text1"/>
+        </w:rPr>
+      </w:pPr>
+    </w:p>
+    <w:p>
+      <w:pPr>
+        <w:rPr>
+          <w:rFonts w:cs="Calibri"/>
+          <w:color w:val="000000" w:themeColor="text1"/>
+        </w:rPr>
+      </w:pPr>
+      <w:r>
+        <w:rPr>
+          <w:rFonts w:cs="Calibri"/>
+          <w:color w:val="000000" w:themeColor="text1"/>
+        </w:rPr>
+        <w:t>4.</w:t>
+      </w:r>
+      <w:r>
+        <w:rPr>
+          <w:rFonts w:cs="Calibri"/>
+          <w:color w:val="000000" w:themeColor="text1"/>
+        </w:rPr>
+        <w:tab/>
+        <w:t>Evidence of Work</w:t>
+      </w:r>
+    </w:p>
+    <w:p>
+      <w:pPr>
+        <w:rPr>
+          <w:rFonts w:cs="Calibri"/>
+          <w:color w:val="000000" w:themeColor="text1"/>
+        </w:rPr>
+      </w:pPr>
+      <w:r>
+        <w:rPr>
+          <w:rFonts w:cs="Calibri"/>
+          <w:color w:val="000000" w:themeColor="text1"/>
+        </w:rPr>
+        <w:t xml:space="preserve"> </w:t>
+      </w:r>
+    </w:p>
+    <w:p>
+      <w:pPr>
+        <w:rPr>
+          <w:rFonts w:cs="Calibri"/>
+          <w:color w:val="000000" w:themeColor="text1"/>
+        </w:rPr>
+      </w:pPr>
+      <w:r>
+        <w:rPr>
+          <w:rFonts w:cs="Calibri"/>
+          <w:noProof/>
+          <w:color w:val="000000" w:themeColor="text1"/>
+        </w:rPr>
+        <w:t xml:space="preserve"> </w:t>
+      </w:r>
+    </w:p>
+    <w:p>
+      <w:pPr>
+        <w:rPr>
+          <w:rFonts w:cs="Calibri"/>
+          <w:color w:val="000000" w:themeColor="text1"/>
+        </w:rPr>
+      </w:pPr>
+      <w:r>
+        <w:rPr>
+          <w:rFonts w:cs="Calibri"/>
+          <w:color w:val="000000" w:themeColor="text1"/>
+        </w:rPr>
+        <w:lastRenderedPageBreak/>
+        <w:t xml:space="preserve"> </w:t>
+      </w:r>
+      <w:r>
+        <w:rPr>
+          <w:rFonts w:cs="Calibri"/>
+          <w:noProof/>
+          <w:color w:val="000000" w:themeColor="text1"/>
+        </w:rPr>
+        <w:drawing>
+          <wp:inline distT="0" distB="0" distL="0" distR="0" wp14:anchorId="58BB95FC" wp14:editId="7D30FCB4">
+            <wp:extent cx="8229600" cy="5344795"/>
+            <wp:effectExtent l="0" t="0" r="0" b="1905"/>
+            <wp:docPr id="545545918" name="Picture 1" descr="A screenshot of a computer&#10;&#10;AI-generated content may be incorrect."/>
+            <wp:cNvGraphicFramePr>
+              <a:graphicFrameLocks xmlns:a="http://schemas.openxmlformats.org/drawingml/2006/main" noChangeAspect="1"/>
+            </wp:cNvGraphicFramePr>
+            <a:graphic xmlns:a="http://schemas.openxmlformats.org/drawingml/2006/main">
+              <a:graphicData uri="http://schemas.openxmlformats.org/drawingml/2006/picture">
+                <pic:pic xmlns:pic="http://schemas.openxmlformats.org/drawingml/2006/picture">
+                  <pic:nvPicPr>
+                    <pic:cNvPr id="545545918" name="Picture 1" descr="A screenshot of a computer&#10;&#10;AI-generated content may be incorrect."/>
+                    <pic:cNvPicPr/>
+                  </pic:nvPicPr>
+                  <pic:blipFill>
+                    <a:blip r:embed="rId5" cstate="print">
+                      <a:extLst>
+                        <a:ext uri="{28A0092B-C50C-407E-A947-70E740481C1C}">
+                          <a14:useLocalDpi xmlns:a14="http://schemas.microsoft.com/office/drawing/2010/main" val="0"/>
+                        </a:ext>
+                      </a:extLst>
+                    </a:blip>
+                    <a:stretch>
+                      <a:fillRect/>
+                    </a:stretch>
+                  </pic:blipFill>
+                  <pic:spPr>
+                    <a:xfrm>
+                      <a:off x="0" y="0"/>
+                      <a:ext cx="8229600" cy="5344795"/>
+                    </a:xfrm>
+                    <a:prstGeom prst="rect">
+                      <a:avLst/>
+                    </a:prstGeom>
+                  </pic:spPr>
+                </pic:pic>
+              </a:graphicData>
+            </a:graphic>
+          </wp:inline>
+        </w:drawing>
+      </w:r>
+    </w:p>
+    <w:p>
+      <w:pPr>
+        <w:rPr>
+          <w:rFonts w:cs="Calibri"/>
+          <w:color w:val="000000" w:themeColor="text1"/>
+        </w:rPr>
+      </w:pPr>
+    </w:p>
+    <w:p>
+      <w:pPr>
+        <w:rPr>
+          <w:rFonts w:cs="Calibri"/>
+          <w:color w:val="000000" w:themeColor="text1"/>
+        </w:rPr>
+      </w:pPr>
+      <w:r>
+        <w:rPr>
+          <w:rFonts w:cs="Calibri"/>
+          <w:noProof/>
+          <w:color w:val="000000" w:themeColor="text1"/>
+        </w:rPr>
+        <w:lastRenderedPageBreak/>
+        <w:drawing>
+          <wp:inline distT="0" distB="0" distL="0" distR="0" wp14:anchorId="3470CBBE" wp14:editId="5733E6FB">
+            <wp:extent cx="8229600" cy="5344795"/>
+            <wp:effectExtent l="0" t="0" r="0" b="1905"/>
+            <wp:docPr id="291156659" name="Picture 3" descr="A screenshot of a computer&#10;&#10;AI-generated content may be incorrect."/>
+            <wp:cNvGraphicFramePr>
+              <a:graphicFrameLocks xmlns:a="http://schemas.openxmlformats.org/drawingml/2006/main" noChangeAspect="1"/>
+            </wp:cNvGraphicFramePr>
+            <a:graphic xmlns:a="http://schemas.openxmlformats.org/drawingml/2006/main">
+              <a:graphicData uri="http://schemas.openxmlformats.org/drawingml/2006/picture">
+                <pic:pic xmlns:pic="http://schemas.openxmlformats.org/drawingml/2006/picture">
+                  <pic:nvPicPr>
+                    <pic:cNvPr id="291156659" name="Picture 3" descr="A screenshot of a computer&#10;&#10;AI-generated content may be incorrect."/>
+                    <pic:cNvPicPr/>
+                  </pic:nvPicPr>
+                  <pic:blipFill>
+                    <a:blip r:embed="rId6" cstate="print">
+                      <a:extLst>
+                        <a:ext uri="{28A0092B-C50C-407E-A947-70E740481C1C}">
+                          <a14:useLocalDpi xmlns:a14="http://schemas.microsoft.com/office/drawing/2010/main" val="0"/>
+                        </a:ext>
+                      </a:extLst>
+                    </a:blip>
+                    <a:stretch>
+                      <a:fillRect/>
+                    </a:stretch>
+                  </pic:blipFill>
+                  <pic:spPr>
+                    <a:xfrm>
+                      <a:off x="0" y="0"/>
+                      <a:ext cx="8229600" cy="5344795"/>
+                    </a:xfrm>
+                    <a:prstGeom prst="rect">
+                      <a:avLst/>
+                    </a:prstGeom>
+                  </pic:spPr>
+                </pic:pic>
+              </a:graphicData>
+            </a:graphic>
+          </wp:inline>
+        </w:drawing>
+      </w:r>
+    </w:p>
+    <w:p>
+      <w:pPr>
+        <w:rPr>
+          <w:rFonts w:cs="Calibri"/>
+          <w:color w:val="000000" w:themeColor="text1"/>
+        </w:rPr>
+      </w:pPr>
+      <w:r>
+        <w:rPr>
+          <w:rFonts w:cs="Calibri"/>
+          <w:noProof/>
+          <w:color w:val="000000" w:themeColor="text1"/>
+        </w:rPr>
+        <w:lastRenderedPageBreak/>
+        <w:drawing>
+          <wp:inline distT="0" distB="0" distL="0" distR="0" wp14:anchorId="0528CC7C" wp14:editId="3A07C596">
+            <wp:extent cx="8229600" cy="5344795"/>
+            <wp:effectExtent l="0" t="0" r="0" b="1905"/>
+            <wp:docPr id="1882143917" name="Picture 2" descr="A screenshot of a computer&#10;&#10;AI-generated content may be incorrect."/>
+            <wp:cNvGraphicFramePr>
+              <a:graphicFrameLocks xmlns:a="http://schemas.openxmlformats.org/drawingml/2006/main" noChangeAspect="1"/>
+            </wp:cNvGraphicFramePr>
+            <a:graphic xmlns:a="http://schemas.openxmlformats.org/drawingml/2006/main">
+              <a:graphicData uri="http://schemas.openxmlformats.org/drawingml/2006/picture">
+                <pic:pic xmlns:pic="http://schemas.openxmlformats.org/drawingml/2006/picture">
+                  <pic:nvPicPr>
+                    <pic:cNvPr id="1882143917" name="Picture 2" descr="A screenshot of a computer&#10;&#10;AI-generated content may be incorrect."/>
+                    <pic:cNvPicPr/>
+                  </pic:nvPicPr>
+                  <pic:blipFill>
+                    <a:blip r:embed="rId7" cstate="print">
+                      <a:extLst>
+                        <a:ext uri="{28A0092B-C50C-407E-A947-70E740481C1C}">
+                          <a14:useLocalDpi xmlns:a14="http://schemas.microsoft.com/office/drawing/2010/main" val="0"/>
+                        </a:ext>
+                      </a:extLst>
+                    </a:blip>
+                    <a:stretch>
+                      <a:fillRect/>
+                    </a:stretch>
+                  </pic:blipFill>
+                  <pic:spPr>
+                    <a:xfrm>
+                      <a:off x="0" y="0"/>
+                      <a:ext cx="8229600" cy="5344795"/>
+                    </a:xfrm>
+                    <a:prstGeom prst="rect">
+                      <a:avLst/>
+                    </a:prstGeom>
+                  </pic:spPr>
+                </pic:pic>
+              </a:graphicData>
+            </a:graphic>
+          </wp:inline>
+        </w:drawing>
+      </w:r>
+    </w:p>
+    <w:p>
+      <w:pPr>
+        <w:rPr>
+          <w:rFonts w:cs="Calibri"/>
+          <w:color w:val="000000" w:themeColor="text1"/>
+        </w:rPr>
+      </w:pPr>
+    </w:p>
+    <w:p>
+      <w:pPr>
+        <w:rPr>
+          <w:rFonts w:cs="Calibri"/>
+          <w:color w:val="000000" w:themeColor="text1"/>
+        </w:rPr>
+      </w:pPr>
+      <w:r>
+        <w:rPr>
+          <w:rFonts w:cs="Calibri"/>
+          <w:noProof/>
+          <w:color w:val="000000" w:themeColor="text1"/>
+        </w:rPr>
+        <w:lastRenderedPageBreak/>
+        <w:drawing>
+          <wp:inline distT="0" distB="0" distL="0" distR="0" wp14:anchorId="5D0F07FE" wp14:editId="61FCCB15">
+            <wp:extent cx="8229600" cy="5344795"/>
+            <wp:effectExtent l="0" t="0" r="0" b="1905"/>
+            <wp:docPr id="1361699588" name="Picture 4" descr="A screenshot of a computer&#10;&#10;AI-generated content may be incorrect."/>
+            <wp:cNvGraphicFramePr>
+              <a:graphicFrameLocks xmlns:a="http://schemas.openxmlformats.org/drawingml/2006/main" noChangeAspect="1"/>
+            </wp:cNvGraphicFramePr>
+            <a:graphic xmlns:a="http://schemas.openxmlformats.org/drawingml/2006/main">
+              <a:graphicData uri="http://schemas.openxmlformats.org/drawingml/2006/picture">
+                <pic:pic xmlns:pic="http://schemas.openxmlformats.org/drawingml/2006/picture">
+                  <pic:nvPicPr>
+                    <pic:cNvPr id="1361699588" name="Picture 4" descr="A screenshot of a computer&#10;&#10;AI-generated content may be incorrect."/>
+                    <pic:cNvPicPr/>
+                  </pic:nvPicPr>
+                  <pic:blipFill>
+                    <a:blip r:embed="rId8" cstate="print">
+                      <a:extLst>
+                        <a:ext uri="{28A0092B-C50C-407E-A947-70E740481C1C}">
+                          <a14:useLocalDpi xmlns:a14="http://schemas.microsoft.com/office/drawing/2010/main" val="0"/>
+                        </a:ext>
+                      </a:extLst>
+                    </a:blip>
+                    <a:stretch>
+                      <a:fillRect/>
+                    </a:stretch>
+                  </pic:blipFill>
+                  <pic:spPr>
+                    <a:xfrm>
+                      <a:off x="0" y="0"/>
+                      <a:ext cx="8229600" cy="5344795"/>
+                    </a:xfrm>
+                    <a:prstGeom prst="rect">
+                      <a:avLst/>
+                    </a:prstGeom>
+                  </pic:spPr>
+                </pic:pic>
+              </a:graphicData>
+            </a:graphic>
+          </wp:inline>
+        </w:drawing>
+      </w:r>
+    </w:p>
+    <w:p>
+      <w:pPr>
+        <w:rPr>
+          <w:rFonts w:cs="Calibri"/>
+          <w:color w:val="000000" w:themeColor="text1"/>
+        </w:rPr>
+      </w:pPr>
+    </w:p>
+    <w:p>
+      <w:pPr>
+        <w:rPr>
+          <w:rFonts w:cs="Calibri"/>
+          <w:color w:val="000000" w:themeColor="text1"/>
+        </w:rPr>
+      </w:pPr>
+    </w:p>
+    <w:p>
+      <w:pPr>
+        <w:rPr>
+          <w:rFonts w:cs="Calibri"/>
+          <w:color w:val="000000" w:themeColor="text1"/>
+        </w:rPr>
+      </w:pPr>
+    </w:p>
+    <w:p>
+      <w:pPr>
+        <w:rPr>
+          <w:rFonts w:cs="Calibri"/>
+          <w:color w:val="000000" w:themeColor="text1"/>
+        </w:rPr>
+      </w:pPr>
+      <w:r>
+        <w:rPr>
+          <w:rFonts w:cs="Calibri"/>
+          <w:noProof/>
+          <w:color w:val="000000" w:themeColor="text1"/>
+        </w:rPr>
+        <w:lastRenderedPageBreak/>
+        <w:drawing>
+          <wp:inline distT="0" distB="0" distL="0" distR="0" wp14:anchorId="6A3DAEDB" wp14:editId="2DCE64C6">
+            <wp:extent cx="8229600" cy="5344795"/>
+            <wp:effectExtent l="0" t="0" r="0" b="1905"/>
+            <wp:docPr id="1076714285" name="Picture 5" descr="A screenshot of a computer&#10;&#10;AI-generated content may be incorrect."/>
+            <wp:cNvGraphicFramePr>
+              <a:graphicFrameLocks xmlns:a="http://schemas.openxmlformats.org/drawingml/2006/main" noChangeAspect="1"/>
+            </wp:cNvGraphicFramePr>
+            <a:graphic xmlns:a="http://schemas.openxmlformats.org/drawingml/2006/main">
+              <a:graphicData uri="http://schemas.openxmlformats.org/drawingml/2006/picture">
+                <pic:pic xmlns:pic="http://schemas.openxmlformats.org/drawingml/2006/picture">
+                  <pic:nvPicPr>
+                    <pic:cNvPr id="1076714285" name="Picture 5" descr="A screenshot of a computer&#10;&#10;AI-generated content may be incorrect."/>
+                    <pic:cNvPicPr/>
+                  </pic:nvPicPr>
+                  <pic:blipFill>
+                    <a:blip r:embed="rId9" cstate="print">
+                      <a:extLst>
+                        <a:ext uri="{28A0092B-C50C-407E-A947-70E740481C1C}">
+                          <a14:useLocalDpi xmlns:a14="http://schemas.microsoft.com/office/drawing/2010/main" val="0"/>
+                        </a:ext>
+                      </a:extLst>
+                    </a:blip>
+                    <a:stretch>
+                      <a:fillRect/>
+                    </a:stretch>
+                  </pic:blipFill>
+                  <pic:spPr>
+                    <a:xfrm>
+                      <a:off x="0" y="0"/>
+                      <a:ext cx="8229600" cy="5344795"/>
+                    </a:xfrm>
+                    <a:prstGeom prst="rect">
+                      <a:avLst/>
+                    </a:prstGeom>
+                  </pic:spPr>
+                </pic:pic>
+              </a:graphicData>
+            </a:graphic>
+          </wp:inline>
+        </w:drawing>
+      </w:r>
+    </w:p>
+    <w:p>
+      <w:pPr>
+        <w:rPr>
+          <w:rFonts w:cs="Calibri"/>
+          <w:color w:val="000000" w:themeColor="text1"/>
+        </w:rPr>
+      </w:pPr>
+      <w:r>
+        <w:rPr>
+          <w:rFonts w:cs="Calibri"/>
+          <w:color w:val="000000" w:themeColor="text1"/>
+        </w:rPr>
+        <w:t>5. Next week’s plan</w:t>
+      </w:r>
+    </w:p>
+    <w:p>
+      <w:pPr>
+        <w:rPr>
+          <w:rFonts w:cs="Calibri"/>
+          <w:color w:val="000000" w:themeColor="text1"/>
+        </w:rPr>
+      </w:pPr>
+      <w:r>
+        <w:rPr>
+          <w:rFonts w:cs="Calibri"/>
+          <w:color w:val="000000" w:themeColor="text1"/>
+        </w:rPr>
+        <w:t>•</w:t>
+      </w:r>
+      <w:r>
+        <w:rPr>
+          <w:rFonts w:ascii="Segoe UI Symbol" w:hAnsi="Segoe UI Symbol" w:cs="Segoe UI Symbol"/>
+          <w:color w:val="000000" w:themeColor="text1"/>
+        </w:rPr>
+        <w:t>⁠</w:t>
+      </w:r>
+      <w:r>
+        <w:rPr>
+          <w:rFonts w:cs="Calibri"/>
+          <w:color w:val="000000" w:themeColor="text1"/>
+        </w:rPr>
+        <w:t xml:space="preserve">  </w:t>
+      </w:r>
+      <w:r>
+        <w:rPr>
+          <w:rFonts w:ascii="Segoe UI Symbol" w:hAnsi="Segoe UI Symbol" w:cs="Segoe UI Symbol"/>
+          <w:color w:val="000000" w:themeColor="text1"/>
+        </w:rPr>
+        <w:t>⁠</w:t>
+      </w:r>
+      <w:r>
+        <w:rPr>
+          <w:rFonts w:cs="Calibri"/>
+          <w:color w:val="000000" w:themeColor="text1"/>
+        </w:rPr>
+        <w:t>Implement s3_service.py for audio uploads.</w:t>
+      </w:r>
+    </w:p>
+    <w:p>
+      <w:pPr>
         <w:pStyle w:val="p1"/>
         <w:rPr>
           <w:rFonts w:ascii="Calibri" w:hAnsi="Calibri" w:cs="Calibri"/>
@@ -1382,115 +2902,18 @@
           <w:sz w:val="22"/>
           <w:szCs w:val="22"/>
         </w:rPr>
-        <w:t xml:space="preserve"> </w:t>
-      </w:r>
-    </w:p>
-    <w:p>
-      <w:pPr>
-        <w:rPr>
-          <w:rFonts w:cs="Calibri"/>
-          <w:color w:val="000000" w:themeColor="text1"/>
-        </w:rPr>
-      </w:pPr>
-    </w:p>
-    <w:p>
-      <w:pPr>
-        <w:rPr>
-          <w:rFonts w:cs="Calibri"/>
-          <w:color w:val="000000" w:themeColor="text1"/>
-        </w:rPr>
-      </w:pPr>
-      <w:r>
-        <w:rPr>
-          <w:rFonts w:cs="Calibri"/>
-          <w:color w:val="000000" w:themeColor="text1"/>
-        </w:rPr>
-        <w:t>4.</w:t>
-      </w:r>
-      <w:r>
-        <w:rPr>
-          <w:rFonts w:cs="Calibri"/>
-          <w:color w:val="000000" w:themeColor="text1"/>
-        </w:rPr>
-        <w:tab/>
-        <w:t>Evidence of Work</w:t>
-      </w:r>
-    </w:p>
-    <w:p>
-      <w:pPr>
-        <w:rPr>
-          <w:rFonts w:cs="Calibri"/>
-          <w:color w:val="000000" w:themeColor="text1"/>
-        </w:rPr>
-      </w:pPr>
-      <w:r>
-        <w:rPr>
-          <w:rFonts w:cs="Calibri"/>
-          <w:color w:val="000000" w:themeColor="text1"/>
-        </w:rPr>
-        <w:t xml:space="preserve"> </w:t>
-      </w:r>
-    </w:p>
-    <w:p>
-      <w:pPr>
-        <w:rPr>
-          <w:rFonts w:cs="Calibri"/>
-          <w:color w:val="000000" w:themeColor="text1"/>
-        </w:rPr>
-      </w:pPr>
-      <w:r>
-        <w:rPr>
-          <w:rFonts w:cs="Calibri"/>
-          <w:noProof/>
-          <w:color w:val="000000" w:themeColor="text1"/>
-        </w:rPr>
-        <w:t xml:space="preserve"> </w:t>
-      </w:r>
-    </w:p>
-    <w:p>
-      <w:pPr>
-        <w:rPr>
-          <w:rFonts w:cs="Calibri"/>
-          <w:color w:val="000000" w:themeColor="text1"/>
-        </w:rPr>
-      </w:pPr>
-      <w:r>
-        <w:rPr>
-          <w:rFonts w:cs="Calibri"/>
-          <w:color w:val="000000" w:themeColor="text1"/>
-        </w:rPr>
-        <w:t xml:space="preserve"> </w:t>
-      </w:r>
-    </w:p>
-    <w:p>
-      <w:pPr>
-        <w:rPr>
-          <w:rFonts w:cs="Calibri"/>
-          <w:color w:val="000000" w:themeColor="text1"/>
-        </w:rPr>
-      </w:pPr>
-      <w:r>
-        <w:rPr>
-          <w:rFonts w:cs="Calibri"/>
-          <w:color w:val="000000" w:themeColor="text1"/>
-        </w:rPr>
-        <w:t>5. Next week’s plan</w:t>
-      </w:r>
-    </w:p>
-    <w:p>
-      <w:pPr>
-        <w:pStyle w:val="p1"/>
-        <w:numPr>
-          <w:ilvl w:val="0"/>
-          <w:numId w:val="7"/>
-        </w:numPr>
-        <w:rPr>
-          <w:rFonts w:ascii="Calibri" w:hAnsi="Calibri" w:cs="Calibri"/>
+        <w:lastRenderedPageBreak/>
+        <w:t>•</w:t>
+      </w:r>
+      <w:r>
+        <w:rPr>
+          <w:rFonts w:ascii="Segoe UI Symbol" w:hAnsi="Segoe UI Symbol" w:cs="Segoe UI Symbol"/>
           <w:color w:val="000000" w:themeColor="text1"/>
           <w:sz w:val="22"/>
           <w:szCs w:val="22"/>
         </w:rPr>
-      </w:pPr>
+        <w:t>⁠</w:t>
+      </w:r>
       <w:r>
         <w:rPr>
           <w:rFonts w:ascii="Calibri" w:hAnsi="Calibri" w:cs="Calibri"/>
@@ -1498,30 +2921,378 @@
           <w:sz w:val="22"/>
           <w:szCs w:val="22"/>
         </w:rPr>
-        <w:t xml:space="preserve"> </w:t>
-      </w:r>
-    </w:p>
-    <w:p>
-      <w:pPr>
-        <w:rPr>
-          <w:rFonts w:cs="Calibri"/>
-          <w:color w:val="000000" w:themeColor="text1"/>
-        </w:rPr>
-      </w:pPr>
-    </w:p>
-    <w:p>
-      <w:pPr>
-        <w:rPr>
-          <w:rFonts w:cs="Calibri"/>
-          <w:color w:val="000000" w:themeColor="text1"/>
-        </w:rPr>
-      </w:pPr>
-    </w:p>
-    <w:p>
-      <w:pPr>
-        <w:rPr>
-          <w:rFonts w:cs="Calibri"/>
-          <w:color w:val="000000" w:themeColor="text1"/>
+        <w:t xml:space="preserve">  </w:t>
+      </w:r>
+      <w:r>
+        <w:rPr>
+          <w:rFonts w:ascii="Segoe UI Symbol" w:hAnsi="Segoe UI Symbol" w:cs="Segoe UI Symbol"/>
+          <w:color w:val="000000" w:themeColor="text1"/>
+          <w:sz w:val="22"/>
+          <w:szCs w:val="22"/>
+        </w:rPr>
+        <w:t>⁠</w:t>
+      </w:r>
+      <w:r>
+        <w:rPr>
+          <w:rFonts w:ascii="Calibri" w:hAnsi="Calibri" w:cs="Calibri"/>
+          <w:color w:val="000000" w:themeColor="text1"/>
+          <w:sz w:val="22"/>
+          <w:szCs w:val="22"/>
+        </w:rPr>
+        <w:t>Generate IAM Access Keys and update .env credentials.</w:t>
+      </w:r>
+    </w:p>
+    <w:p>
+      <w:pPr>
+        <w:pStyle w:val="p1"/>
+        <w:rPr>
+          <w:rFonts w:ascii="Calibri" w:hAnsi="Calibri" w:cs="Calibri"/>
+          <w:color w:val="000000" w:themeColor="text1"/>
+          <w:sz w:val="22"/>
+          <w:szCs w:val="22"/>
+        </w:rPr>
+      </w:pPr>
+      <w:r>
+        <w:rPr>
+          <w:rFonts w:ascii="Calibri" w:hAnsi="Calibri" w:cs="Calibri"/>
+          <w:color w:val="000000" w:themeColor="text1"/>
+          <w:sz w:val="22"/>
+          <w:szCs w:val="22"/>
+        </w:rPr>
+        <w:t>•</w:t>
+      </w:r>
+      <w:r>
+        <w:rPr>
+          <w:rFonts w:ascii="Segoe UI Symbol" w:hAnsi="Segoe UI Symbol" w:cs="Segoe UI Symbol"/>
+          <w:color w:val="000000" w:themeColor="text1"/>
+          <w:sz w:val="22"/>
+          <w:szCs w:val="22"/>
+        </w:rPr>
+        <w:t>⁠</w:t>
+      </w:r>
+      <w:r>
+        <w:rPr>
+          <w:rFonts w:ascii="Calibri" w:hAnsi="Calibri" w:cs="Calibri"/>
+          <w:color w:val="000000" w:themeColor="text1"/>
+          <w:sz w:val="22"/>
+          <w:szCs w:val="22"/>
+        </w:rPr>
+        <w:t xml:space="preserve">  </w:t>
+      </w:r>
+      <w:r>
+        <w:rPr>
+          <w:rFonts w:ascii="Segoe UI Symbol" w:hAnsi="Segoe UI Symbol" w:cs="Segoe UI Symbol"/>
+          <w:color w:val="000000" w:themeColor="text1"/>
+          <w:sz w:val="22"/>
+          <w:szCs w:val="22"/>
+        </w:rPr>
+        <w:t>⁠</w:t>
+      </w:r>
+      <w:r>
+        <w:rPr>
+          <w:rFonts w:ascii="Calibri" w:hAnsi="Calibri" w:cs="Calibri"/>
+          <w:color w:val="000000" w:themeColor="text1"/>
+          <w:sz w:val="22"/>
+          <w:szCs w:val="22"/>
+        </w:rPr>
+        <w:t>Add /</w:t>
+      </w:r>
+      <w:proofErr w:type="spellStart"/>
+      <w:r>
+        <w:rPr>
+          <w:rFonts w:ascii="Calibri" w:hAnsi="Calibri" w:cs="Calibri"/>
+          <w:color w:val="000000" w:themeColor="text1"/>
+          <w:sz w:val="22"/>
+          <w:szCs w:val="22"/>
+        </w:rPr>
+        <w:t>api</w:t>
+      </w:r>
+      <w:proofErr w:type="spellEnd"/>
+      <w:r>
+        <w:rPr>
+          <w:rFonts w:ascii="Calibri" w:hAnsi="Calibri" w:cs="Calibri"/>
+          <w:color w:val="000000" w:themeColor="text1"/>
+          <w:sz w:val="22"/>
+          <w:szCs w:val="22"/>
+        </w:rPr>
+        <w:t>/audio/upload endpoint in backend.</w:t>
+      </w:r>
+    </w:p>
+    <w:p>
+      <w:pPr>
+        <w:pStyle w:val="p1"/>
+        <w:rPr>
+          <w:rFonts w:ascii="Calibri" w:hAnsi="Calibri" w:cs="Calibri"/>
+          <w:color w:val="000000" w:themeColor="text1"/>
+          <w:sz w:val="22"/>
+          <w:szCs w:val="22"/>
+        </w:rPr>
+      </w:pPr>
+      <w:r>
+        <w:rPr>
+          <w:rFonts w:ascii="Calibri" w:hAnsi="Calibri" w:cs="Calibri"/>
+          <w:color w:val="000000" w:themeColor="text1"/>
+          <w:sz w:val="22"/>
+          <w:szCs w:val="22"/>
+        </w:rPr>
+        <w:t>•</w:t>
+      </w:r>
+      <w:r>
+        <w:rPr>
+          <w:rFonts w:ascii="Segoe UI Symbol" w:hAnsi="Segoe UI Symbol" w:cs="Segoe UI Symbol"/>
+          <w:color w:val="000000" w:themeColor="text1"/>
+          <w:sz w:val="22"/>
+          <w:szCs w:val="22"/>
+        </w:rPr>
+        <w:t>⁠</w:t>
+      </w:r>
+      <w:r>
+        <w:rPr>
+          <w:rFonts w:ascii="Calibri" w:hAnsi="Calibri" w:cs="Calibri"/>
+          <w:color w:val="000000" w:themeColor="text1"/>
+          <w:sz w:val="22"/>
+          <w:szCs w:val="22"/>
+        </w:rPr>
+        <w:t xml:space="preserve">  </w:t>
+      </w:r>
+      <w:r>
+        <w:rPr>
+          <w:rFonts w:ascii="Segoe UI Symbol" w:hAnsi="Segoe UI Symbol" w:cs="Segoe UI Symbol"/>
+          <w:color w:val="000000" w:themeColor="text1"/>
+          <w:sz w:val="22"/>
+          <w:szCs w:val="22"/>
+        </w:rPr>
+        <w:t>⁠</w:t>
+      </w:r>
+      <w:r>
+        <w:rPr>
+          <w:rFonts w:ascii="Calibri" w:hAnsi="Calibri" w:cs="Calibri"/>
+          <w:color w:val="000000" w:themeColor="text1"/>
+          <w:sz w:val="22"/>
+          <w:szCs w:val="22"/>
+        </w:rPr>
+        <w:t>Begin frontend integration for voice upload button.</w:t>
+      </w:r>
+    </w:p>
+    <w:p>
+      <w:pPr>
+        <w:pStyle w:val="p1"/>
+        <w:rPr>
+          <w:rFonts w:ascii="Calibri" w:hAnsi="Calibri" w:cs="Calibri"/>
+          <w:color w:val="000000" w:themeColor="text1"/>
+          <w:sz w:val="22"/>
+          <w:szCs w:val="22"/>
+        </w:rPr>
+      </w:pPr>
+      <w:r>
+        <w:rPr>
+          <w:rFonts w:ascii="Calibri" w:hAnsi="Calibri" w:cs="Calibri"/>
+          <w:color w:val="000000" w:themeColor="text1"/>
+          <w:sz w:val="22"/>
+          <w:szCs w:val="22"/>
+        </w:rPr>
+        <w:t>•</w:t>
+      </w:r>
+      <w:r>
+        <w:rPr>
+          <w:rFonts w:ascii="Segoe UI Symbol" w:hAnsi="Segoe UI Symbol" w:cs="Segoe UI Symbol"/>
+          <w:color w:val="000000" w:themeColor="text1"/>
+          <w:sz w:val="22"/>
+          <w:szCs w:val="22"/>
+        </w:rPr>
+        <w:t>⁠</w:t>
+      </w:r>
+      <w:r>
+        <w:rPr>
+          <w:rFonts w:ascii="Calibri" w:hAnsi="Calibri" w:cs="Calibri"/>
+          <w:color w:val="000000" w:themeColor="text1"/>
+          <w:sz w:val="22"/>
+          <w:szCs w:val="22"/>
+        </w:rPr>
+        <w:t xml:space="preserve">  </w:t>
+      </w:r>
+      <w:r>
+        <w:rPr>
+          <w:rFonts w:ascii="Segoe UI Symbol" w:hAnsi="Segoe UI Symbol" w:cs="Segoe UI Symbol"/>
+          <w:color w:val="000000" w:themeColor="text1"/>
+          <w:sz w:val="22"/>
+          <w:szCs w:val="22"/>
+        </w:rPr>
+        <w:t>⁠</w:t>
+      </w:r>
+      <w:r>
+        <w:rPr>
+          <w:rFonts w:ascii="Calibri" w:hAnsi="Calibri" w:cs="Calibri"/>
+          <w:color w:val="000000" w:themeColor="text1"/>
+          <w:sz w:val="22"/>
+          <w:szCs w:val="22"/>
+        </w:rPr>
+        <w:t>Connect AWS Transcribe to convert audio to text and store in RDS.</w:t>
+      </w:r>
+    </w:p>
+    <w:p>
+      <w:pPr>
+        <w:pStyle w:val="p1"/>
+        <w:rPr>
+          <w:rFonts w:ascii="Calibri" w:hAnsi="Calibri" w:cs="Calibri"/>
+          <w:color w:val="000000" w:themeColor="text1"/>
+          <w:sz w:val="22"/>
+          <w:szCs w:val="22"/>
+        </w:rPr>
+      </w:pPr>
+      <w:r>
+        <w:rPr>
+          <w:rFonts w:ascii="Calibri" w:hAnsi="Calibri" w:cs="Calibri"/>
+          <w:color w:val="000000" w:themeColor="text1"/>
+          <w:sz w:val="22"/>
+          <w:szCs w:val="22"/>
+        </w:rPr>
+        <w:t>•</w:t>
+      </w:r>
+      <w:r>
+        <w:rPr>
+          <w:rFonts w:ascii="Segoe UI Symbol" w:hAnsi="Segoe UI Symbol" w:cs="Segoe UI Symbol"/>
+          <w:color w:val="000000" w:themeColor="text1"/>
+          <w:sz w:val="22"/>
+          <w:szCs w:val="22"/>
+        </w:rPr>
+        <w:t>⁠</w:t>
+      </w:r>
+      <w:r>
+        <w:rPr>
+          <w:rFonts w:ascii="Calibri" w:hAnsi="Calibri" w:cs="Calibri"/>
+          <w:color w:val="000000" w:themeColor="text1"/>
+          <w:sz w:val="22"/>
+          <w:szCs w:val="22"/>
+        </w:rPr>
+        <w:t xml:space="preserve">  </w:t>
+      </w:r>
+      <w:r>
+        <w:rPr>
+          <w:rFonts w:ascii="Segoe UI Symbol" w:hAnsi="Segoe UI Symbol" w:cs="Segoe UI Symbol"/>
+          <w:color w:val="000000" w:themeColor="text1"/>
+          <w:sz w:val="22"/>
+          <w:szCs w:val="22"/>
+        </w:rPr>
+        <w:t>⁠</w:t>
+      </w:r>
+      <w:r>
+        <w:rPr>
+          <w:rFonts w:ascii="Calibri" w:hAnsi="Calibri" w:cs="Calibri"/>
+          <w:color w:val="000000" w:themeColor="text1"/>
+          <w:sz w:val="22"/>
+          <w:szCs w:val="22"/>
+        </w:rPr>
+        <w:t>Start planning Polly voice feedback integration.</w:t>
+      </w:r>
+    </w:p>
+    <w:p>
+      <w:pPr>
+        <w:pStyle w:val="p1"/>
+        <w:rPr>
+          <w:rFonts w:ascii="Calibri" w:hAnsi="Calibri" w:cs="Calibri"/>
+          <w:color w:val="000000" w:themeColor="text1"/>
+          <w:sz w:val="22"/>
+          <w:szCs w:val="22"/>
+        </w:rPr>
+      </w:pPr>
+    </w:p>
+    <w:p>
+      <w:pPr>
+        <w:pStyle w:val="p1"/>
+        <w:rPr>
+          <w:rFonts w:ascii="Calibri" w:hAnsi="Calibri" w:cs="Calibri"/>
+          <w:color w:val="000000" w:themeColor="text1"/>
+          <w:sz w:val="22"/>
+          <w:szCs w:val="22"/>
+        </w:rPr>
+      </w:pPr>
+    </w:p>
+    <w:p>
+      <w:pPr>
+        <w:pStyle w:val="p1"/>
+        <w:rPr>
+          <w:rFonts w:ascii="Calibri" w:hAnsi="Calibri" w:cs="Calibri"/>
+          <w:color w:val="000000" w:themeColor="text1"/>
+          <w:sz w:val="22"/>
+          <w:szCs w:val="22"/>
+        </w:rPr>
+      </w:pPr>
+    </w:p>
+    <w:p>
+      <w:pPr>
+        <w:pStyle w:val="p1"/>
+        <w:rPr>
+          <w:rFonts w:ascii="Calibri" w:hAnsi="Calibri" w:cs="Calibri"/>
+          <w:color w:val="000000" w:themeColor="text1"/>
+          <w:sz w:val="22"/>
+          <w:szCs w:val="22"/>
+        </w:rPr>
+      </w:pPr>
+    </w:p>
+    <w:p>
+      <w:pPr>
+        <w:pStyle w:val="p1"/>
+        <w:rPr>
+          <w:rFonts w:ascii="Calibri" w:hAnsi="Calibri" w:cs="Calibri"/>
+          <w:color w:val="000000" w:themeColor="text1"/>
+          <w:sz w:val="22"/>
+          <w:szCs w:val="22"/>
+        </w:rPr>
+      </w:pPr>
+    </w:p>
+    <w:p>
+      <w:pPr>
+        <w:pStyle w:val="p1"/>
+        <w:rPr>
+          <w:rFonts w:ascii="Calibri" w:hAnsi="Calibri" w:cs="Calibri"/>
+          <w:color w:val="000000" w:themeColor="text1"/>
+          <w:sz w:val="22"/>
+          <w:szCs w:val="22"/>
+        </w:rPr>
+      </w:pPr>
+    </w:p>
+    <w:p>
+      <w:pPr>
+        <w:pStyle w:val="p1"/>
+        <w:rPr>
+          <w:rFonts w:ascii="Calibri" w:hAnsi="Calibri" w:cs="Calibri"/>
+          <w:color w:val="000000" w:themeColor="text1"/>
+          <w:sz w:val="22"/>
+          <w:szCs w:val="22"/>
+        </w:rPr>
+      </w:pPr>
+    </w:p>
+    <w:p>
+      <w:pPr>
+        <w:pStyle w:val="p1"/>
+        <w:rPr>
+          <w:rFonts w:ascii="Calibri" w:hAnsi="Calibri" w:cs="Calibri"/>
+          <w:color w:val="000000" w:themeColor="text1"/>
+          <w:sz w:val="22"/>
+          <w:szCs w:val="22"/>
+        </w:rPr>
+      </w:pPr>
+    </w:p>
+    <w:p>
+      <w:pPr>
+        <w:pStyle w:val="p1"/>
+        <w:rPr>
+          <w:rFonts w:ascii="Calibri" w:hAnsi="Calibri" w:cs="Calibri"/>
+          <w:color w:val="000000" w:themeColor="text1"/>
+          <w:sz w:val="22"/>
+          <w:szCs w:val="22"/>
+        </w:rPr>
+      </w:pPr>
+    </w:p>
+    <w:p>
+      <w:pPr>
+        <w:pStyle w:val="p1"/>
+        <w:rPr>
+          <w:rFonts w:ascii="Calibri" w:hAnsi="Calibri" w:cs="Calibri"/>
+          <w:color w:val="000000" w:themeColor="text1"/>
+          <w:sz w:val="22"/>
+          <w:szCs w:val="22"/>
         </w:rPr>
       </w:pPr>
     </w:p>
@@ -3189,7 +4960,7 @@
                     <pic:cNvPicPr/>
                   </pic:nvPicPr>
                   <pic:blipFill>
-                    <a:blip r:embed="rId5" cstate="print">
+                    <a:blip r:embed="rId10" cstate="print">
                       <a:extLst>
                         <a:ext uri="{28A0092B-C50C-407E-A947-70E740481C1C}">
                           <a14:useLocalDpi xmlns:a14="http://schemas.microsoft.com/office/drawing/2010/main" val="0"/>
@@ -3268,7 +5039,7 @@
                     <pic:cNvPicPr/>
                   </pic:nvPicPr>
                   <pic:blipFill>
-                    <a:blip r:embed="rId6" cstate="print">
+                    <a:blip r:embed="rId11" cstate="print">
                       <a:extLst>
                         <a:ext uri="{28A0092B-C50C-407E-A947-70E740481C1C}">
                           <a14:useLocalDpi xmlns:a14="http://schemas.microsoft.com/office/drawing/2010/main" val="0"/>
@@ -5192,7 +6963,7 @@
           <w:color w:val="000000" w:themeColor="text1"/>
         </w:rPr>
       </w:pPr>
-      <w:hyperlink r:id="rId7" w:history="1">
+      <w:hyperlink r:id="rId12" w:history="1">
         <w:r>
           <w:rPr>
             <w:rStyle w:val="Hyperlink"/>
@@ -5295,7 +7066,7 @@
                     <pic:cNvPicPr/>
                   </pic:nvPicPr>
                   <pic:blipFill>
-                    <a:blip r:embed="rId8" cstate="print">
+                    <a:blip r:embed="rId13" cstate="print">
                       <a:extLst>
                         <a:ext uri="{28A0092B-C50C-407E-A947-70E740481C1C}">
                           <a14:useLocalDpi xmlns:a14="http://schemas.microsoft.com/office/drawing/2010/main" val="0"/>
@@ -5361,7 +7132,7 @@
           <w:color w:val="000000" w:themeColor="text1"/>
         </w:rPr>
       </w:pPr>
-      <w:hyperlink r:id="rId9" w:history="1">
+      <w:hyperlink r:id="rId14" w:history="1">
         <w:r>
           <w:rPr>
             <w:rStyle w:val="Hyperlink"/>

</xml_diff>